<commit_message>
docs(domains): update student guides to the digitalrcc.com lab hostnames
</commit_message>
<xml_diff>
--- a/docs/IA-Lab-Completion-Guide.docx
+++ b/docs/IA-Lab-Completion-Guide.docx
@@ -685,7 +685,7 @@
             <w:rStyle w:val="Hyperlink"/>
             <w:b/>
           </w:rPr>
-          <w:t xml:space="preserve">https://crc.guac.01.tcecure.com/#/</w:t>
+          <w:t xml:space="preserve">https://guac.01.digitalrcc.com/#/</w:t>
         </w:r>
       </w:hyperlink>
     </w:p>
@@ -1113,7 +1113,7 @@
             <w:rStyle w:val="Hyperlink"/>
             <w:b/>
           </w:rPr>
-          <w:t xml:space="preserve">https://training.status.tcecure.com/pod/XX</w:t>
+          <w:t xml:space="preserve">https://training.digitalrcc.com/pod/XX</w:t>
         </w:r>
       </w:hyperlink>
       <w:r>
@@ -5053,7 +5053,7 @@
         <w:t xml:space="preserve"> </w:t>
       </w:r>
       <w:r>
-        <w:t xml:space="preserve">Hands-on (ADUC) — task retarget step is instructor-credited this cohort</w:t>
+        <w:t xml:space="preserve">Hands-on (ADUC + Task Scheduler)</w:t>
       </w:r>
     </w:p>
     <w:p>
@@ -5064,52 +5064,82 @@
         <w:rPr>
           <w:b/>
         </w:rPr>
-        <w:t xml:space="preserve">Read first — this cohort:</w:t>
-      </w:r>
-      <w:r>
-        <w:t xml:space="preserve"> </w:t>
-      </w:r>
-      <w:r>
-        <w:t xml:space="preserve">Step 2 (repointing the scheduled task) cannot be done from a student account on the shared domain controller. Windows only lets a local administrator save a task credential, and students are intentionally not administrators there. Complete</w:t>
-      </w:r>
-      <w:r>
-        <w:t xml:space="preserve"> </w:t>
-      </w:r>
-      <w:r>
-        <w:rPr>
-          <w:b/>
-        </w:rPr>
-        <w:t xml:space="preserve">Step 1</w:t>
-      </w:r>
-      <w:r>
-        <w:t xml:space="preserve"> </w:t>
-      </w:r>
-      <w:r>
-        <w:t xml:space="preserve">(create</w:t>
-      </w:r>
-      <w:r>
-        <w:t xml:space="preserve"> </w:t>
-      </w:r>
-      <w:r>
-        <w:rPr>
-          <w:rStyle w:val="VerbatimChar"/>
-        </w:rPr>
-        <w:t xml:space="preserve">PXX-svc_backup</w:t>
-      </w:r>
-      <w:r>
-        <w:t xml:space="preserve">), read Step 2 so you know how it is done, then move on to</w:t>
-      </w:r>
-      <w:r>
-        <w:t xml:space="preserve"> </w:t>
-      </w:r>
-      <w:r>
-        <w:rPr>
-          <w:b/>
-        </w:rPr>
-        <w:t xml:space="preserve">M2-L2</w:t>
-      </w:r>
-      <w:r>
-        <w:t xml:space="preserve">. Step 2 is credited automatically and no longer affects your completion status. Pods get their own member servers in a later release, where you will perform this step yourself.</w:t>
+        <w:t xml:space="preserve">Where the task lives:</w:t>
+      </w:r>
+      <w:r>
+        <w:t xml:space="preserve"> </w:t>
+      </w:r>
+      <w:r>
+        <w:rPr>
+          <w:rStyle w:val="VerbatimChar"/>
+        </w:rPr>
+        <w:t xml:space="preserve">PodXX ACS Nightly Backup</w:t>
+      </w:r>
+      <w:r>
+        <w:t xml:space="preserve"> </w:t>
+      </w:r>
+      <w:r>
+        <w:t xml:space="preserve">is a task on</w:t>
+      </w:r>
+      <w:r>
+        <w:t xml:space="preserve"> </w:t>
+      </w:r>
+      <w:r>
+        <w:rPr>
+          <w:b/>
+        </w:rPr>
+        <w:t xml:space="preserve">your own</w:t>
+      </w:r>
+      <w:r>
+        <w:rPr>
+          <w:b/>
+        </w:rPr>
+        <w:t xml:space="preserve"> </w:t>
+      </w:r>
+      <w:r>
+        <w:rPr>
+          <w:b/>
+        </w:rPr>
+        <w:t xml:space="preserve">pod server</w:t>
+      </w:r>
+      <w:r>
+        <w:t xml:space="preserve">, not on the domain controller, and you are a local administrator</w:t>
+      </w:r>
+      <w:r>
+        <w:t xml:space="preserve"> </w:t>
+      </w:r>
+      <w:r>
+        <w:t xml:space="preserve">there — so you make the change yourself and both steps below are graded. Open</w:t>
+      </w:r>
+      <w:r>
+        <w:t xml:space="preserve"> </w:t>
+      </w:r>
+      <w:r>
+        <w:t xml:space="preserve">Task Scheduler from an elevated session (right-click →</w:t>
+      </w:r>
+      <w:r>
+        <w:t xml:space="preserve"> </w:t>
+      </w:r>
+      <w:r>
+        <w:rPr>
+          <w:b/>
+        </w:rPr>
+        <w:t xml:space="preserve">Run as</w:t>
+      </w:r>
+      <w:r>
+        <w:rPr>
+          <w:b/>
+        </w:rPr>
+        <w:t xml:space="preserve"> </w:t>
+      </w:r>
+      <w:r>
+        <w:rPr>
+          <w:b/>
+        </w:rPr>
+        <w:t xml:space="preserve">administrator</w:t>
+      </w:r>
+      <w:r>
+        <w:t xml:space="preserve">) so Windows lets you save the task credential.</w:t>
       </w:r>
     </w:p>
     <w:p>
@@ -5392,19 +5422,7 @@
         <w:rPr>
           <w:b/>
         </w:rPr>
-        <w:t xml:space="preserve">Point the task at the service account</w:t>
-      </w:r>
-      <w:r>
-        <w:t xml:space="preserve"> </w:t>
-      </w:r>
-      <w:r>
-        <w:rPr>
-          <w:i/>
-        </w:rPr>
-        <w:t xml:space="preserve">(reference only this cohort — expect "Access is denied"; do not troubleshoot it)</w:t>
-      </w:r>
-      <w:r>
-        <w:t xml:space="preserve">:</w:t>
+        <w:t xml:space="preserve">Point the task at the service account:</w:t>
       </w:r>
     </w:p>
     <w:p>
@@ -5641,25 +5659,7 @@
         <w:rPr>
           <w:b/>
         </w:rPr>
-        <w:t xml:space="preserve">Look at the task, read-only.</w:t>
-      </w:r>
-      <w:r>
-        <w:t xml:space="preserve"> </w:t>
-      </w:r>
-      <w:r>
-        <w:t xml:space="preserve">You can open the task and view its settings;</w:t>
-      </w:r>
-      <w:r>
-        <w:t xml:space="preserve"> </w:t>
-      </w:r>
-      <w:r>
-        <w:t xml:space="preserve">you cannot save a change to the account it runs under. This command shows the</w:t>
-      </w:r>
-      <w:r>
-        <w:t xml:space="preserve"> </w:t>
-      </w:r>
-      <w:r>
-        <w:t xml:space="preserve">account it currently uses:</w:t>
+        <w:t xml:space="preserve">Confirm the change:</w:t>
       </w:r>
     </w:p>
     <w:p>
@@ -5715,7 +5715,166 @@
         </w:numPr>
       </w:pPr>
       <w:r>
-        <w:t xml:space="preserve">It still returns</w:t>
+        <w:t xml:space="preserve">It should now return</w:t>
+      </w:r>
+      <w:r>
+        <w:t xml:space="preserve"> </w:t>
+      </w:r>
+      <w:r>
+        <w:rPr>
+          <w:rStyle w:val="VerbatimChar"/>
+        </w:rPr>
+        <w:t xml:space="preserve">ACS-P01\PXX-svc_backup</w:t>
+      </w:r>
+      <w:r>
+        <w:t xml:space="preserve">.</w:t>
+      </w:r>
+    </w:p>
+    <w:p>
+      <w:pPr>
+        <w:pStyle w:val="BlockText"/>
+      </w:pPr>
+      <w:r>
+        <w:rPr>
+          <w:b/>
+        </w:rPr>
+        <w:t xml:space="preserve">If Windows warns "Batch logon privilege needs to be enabled":</w:t>
+      </w:r>
+      <w:r>
+        <w:t xml:space="preserve"> </w:t>
+      </w:r>
+      <w:r>
+        <w:t xml:space="preserve">the task is</w:t>
+      </w:r>
+      <w:r>
+        <w:t xml:space="preserve"> </w:t>
+      </w:r>
+      <w:r>
+        <w:t xml:space="preserve">saved and graded, but it cannot actually start until the service account holds</w:t>
+      </w:r>
+      <w:r>
+        <w:t xml:space="preserve"> </w:t>
+      </w:r>
+      <w:r>
+        <w:t xml:space="preserve">that right. Grant it on your own server in</w:t>
+      </w:r>
+      <w:r>
+        <w:t xml:space="preserve"> </w:t>
+      </w:r>
+      <w:r>
+        <w:rPr>
+          <w:b/>
+        </w:rPr>
+        <w:t xml:space="preserve">secpol.msc → Local Policies →</w:t>
+      </w:r>
+      <w:r>
+        <w:rPr>
+          <w:b/>
+        </w:rPr>
+        <w:t xml:space="preserve"> </w:t>
+      </w:r>
+      <w:r>
+        <w:rPr>
+          <w:b/>
+        </w:rPr>
+        <w:t xml:space="preserve">User Rights Assignment → Log on as a batch job</w:t>
+      </w:r>
+      <w:r>
+        <w:t xml:space="preserve">, add</w:t>
+      </w:r>
+      <w:r>
+        <w:t xml:space="preserve"> </w:t>
+      </w:r>
+      <w:r>
+        <w:rPr>
+          <w:rStyle w:val="VerbatimChar"/>
+        </w:rPr>
+        <w:t xml:space="preserve">PXX-svc_backup</w:t>
+      </w:r>
+      <w:r>
+        <w:t xml:space="preserve">, and</w:t>
+      </w:r>
+      <w:r>
+        <w:t xml:space="preserve"> </w:t>
+      </w:r>
+      <w:r>
+        <w:t xml:space="preserve">reopen the task to confirm it saves without the warning.</w:t>
+      </w:r>
+    </w:p>
+    <w:p>
+      <w:pPr>
+        <w:pStyle w:val="Heading4"/>
+      </w:pPr>
+      <w:bookmarkStart w:id="61" w:name="completion-criteria-3"/>
+      <w:r>
+        <w:t xml:space="preserve">Completion Criteria</w:t>
+      </w:r>
+      <w:bookmarkEnd w:id="61"/>
+    </w:p>
+    <w:p>
+      <w:pPr>
+        <w:numPr>
+          <w:ilvl w:val="0"/>
+          <w:numId w:val="1030"/>
+        </w:numPr>
+        <w:pStyle w:val="Compact"/>
+      </w:pPr>
+      <w:r>
+        <w:t xml:space="preserve">☐</w:t>
+      </w:r>
+      <w:r>
+        <w:t xml:space="preserve"> </w:t>
+      </w:r>
+      <w:r>
+        <w:rPr>
+          <w:rStyle w:val="VerbatimChar"/>
+        </w:rPr>
+        <w:t xml:space="preserve">PXX-svc_backup</w:t>
+      </w:r>
+      <w:r>
+        <w:t xml:space="preserve"> </w:t>
+      </w:r>
+      <w:r>
+        <w:t xml:space="preserve">exists in Active Directory</w:t>
+      </w:r>
+    </w:p>
+    <w:p>
+      <w:pPr>
+        <w:numPr>
+          <w:ilvl w:val="0"/>
+          <w:numId w:val="1030"/>
+        </w:numPr>
+        <w:pStyle w:val="Compact"/>
+      </w:pPr>
+      <w:r>
+        <w:t xml:space="preserve">☐</w:t>
+      </w:r>
+      <w:r>
+        <w:t xml:space="preserve"> </w:t>
+      </w:r>
+      <w:r>
+        <w:rPr>
+          <w:rStyle w:val="VerbatimChar"/>
+        </w:rPr>
+        <w:t xml:space="preserve">PodXX ACS Nightly Backup</w:t>
+      </w:r>
+      <w:r>
+        <w:t xml:space="preserve"> </w:t>
+      </w:r>
+      <w:r>
+        <w:t xml:space="preserve">on your pod server runs as</w:t>
+      </w:r>
+      <w:r>
+        <w:t xml:space="preserve"> </w:t>
+      </w:r>
+      <w:r>
+        <w:rPr>
+          <w:rStyle w:val="VerbatimChar"/>
+        </w:rPr>
+        <w:t xml:space="preserve">PXX-svc_backup</w:t>
+      </w:r>
+      <w:r>
+        <w:t xml:space="preserve">, not</w:t>
       </w:r>
       <w:r>
         <w:t xml:space="preserve"> </w:t>
@@ -5725,58 +5884,6 @@
           <w:rStyle w:val="VerbatimChar"/>
         </w:rPr>
         <w:t xml:space="preserve">PXX-s.jenkins</w:t>
-      </w:r>
-      <w:r>
-        <w:t xml:space="preserve">, and that is the expected result this cohort.</w:t>
-      </w:r>
-    </w:p>
-    <w:p>
-      <w:pPr>
-        <w:pStyle w:val="Heading4"/>
-      </w:pPr>
-      <w:bookmarkStart w:id="61" w:name="completion-criteria-3"/>
-      <w:r>
-        <w:t xml:space="preserve">Completion Criteria</w:t>
-      </w:r>
-      <w:bookmarkEnd w:id="61"/>
-    </w:p>
-    <w:p>
-      <w:pPr>
-        <w:numPr>
-          <w:ilvl w:val="0"/>
-          <w:numId w:val="1030"/>
-        </w:numPr>
-        <w:pStyle w:val="Compact"/>
-      </w:pPr>
-      <w:r>
-        <w:t xml:space="preserve">☐</w:t>
-      </w:r>
-      <w:r>
-        <w:t xml:space="preserve"> </w:t>
-      </w:r>
-      <w:r>
-        <w:rPr>
-          <w:rStyle w:val="VerbatimChar"/>
-        </w:rPr>
-        <w:t xml:space="preserve">PXX-svc_backup</w:t>
-      </w:r>
-      <w:r>
-        <w:t xml:space="preserve"> </w:t>
-      </w:r>
-      <w:r>
-        <w:t xml:space="preserve">exists in Active Directory</w:t>
-      </w:r>
-    </w:p>
-    <w:p>
-      <w:pPr>
-        <w:numPr>
-          <w:ilvl w:val="0"/>
-          <w:numId w:val="1030"/>
-        </w:numPr>
-        <w:pStyle w:val="Compact"/>
-      </w:pPr>
-      <w:r>
-        <w:t xml:space="preserve">☐ Task principal change — credited automatically this cohort (requires administrator on the shared DC)</w:t>
       </w:r>
     </w:p>
     <w:p>
@@ -7676,7 +7783,7 @@
         <w:t xml:space="preserve"> </w:t>
       </w:r>
       <w:r>
-        <w:t xml:space="preserve">Review and verify</w:t>
+        <w:t xml:space="preserve">Hands-on (Local Security Policy)</w:t>
       </w:r>
     </w:p>
     <w:p>
@@ -7687,79 +7794,58 @@
         <w:rPr>
           <w:b/>
         </w:rPr>
-        <w:t xml:space="preserve">This cohort:</w:t>
-      </w:r>
-      <w:r>
-        <w:t xml:space="preserve"> </w:t>
-      </w:r>
-      <w:r>
-        <w:t xml:space="preserve">changing the domain password policy requires Domain Admin</w:t>
-      </w:r>
-      <w:r>
-        <w:t xml:space="preserve"> </w:t>
-      </w:r>
-      <w:r>
-        <w:t xml:space="preserve">rights, and the policy is shared by all 20 pods — one student's change would</w:t>
-      </w:r>
-      <w:r>
-        <w:t xml:space="preserve"> </w:t>
-      </w:r>
-      <w:r>
-        <w:t xml:space="preserve">apply to everyone. The instructor has therefore applied the hardened policy</w:t>
-      </w:r>
-      <w:r>
-        <w:t xml:space="preserve"> </w:t>
-      </w:r>
-      <w:r>
-        <w:t xml:space="preserve">centrally. Work through the settings below and</w:t>
-      </w:r>
-      <w:r>
-        <w:t xml:space="preserve"> </w:t>
-      </w:r>
-      <w:r>
-        <w:rPr>
-          <w:b/>
-        </w:rPr>
-        <w:t xml:space="preserve">verify</w:t>
-      </w:r>
-      <w:r>
-        <w:t xml:space="preserve"> </w:t>
-      </w:r>
-      <w:r>
-        <w:t xml:space="preserve">the live policy in</w:t>
-      </w:r>
-      <w:r>
-        <w:t xml:space="preserve"> </w:t>
-      </w:r>
-      <w:r>
-        <w:t xml:space="preserve">step 2; do not attempt the</w:t>
-      </w:r>
-      <w:r>
-        <w:t xml:space="preserve"> </w:t>
-      </w:r>
-      <w:r>
-        <w:rPr>
-          <w:rStyle w:val="VerbatimChar"/>
-        </w:rPr>
-        <w:t xml:space="preserve">Set-</w:t>
-      </w:r>
-      <w:r>
-        <w:t xml:space="preserve"> </w:t>
-      </w:r>
-      <w:r>
-        <w:t xml:space="preserve">command or the GPO edit (both will be denied).</w:t>
-      </w:r>
-      <w:r>
-        <w:t xml:space="preserve"> </w:t>
-      </w:r>
-      <w:r>
-        <w:t xml:space="preserve">When pods move to their own servers you will set this policy yourself, on your</w:t>
-      </w:r>
-      <w:r>
-        <w:t xml:space="preserve"> </w:t>
-      </w:r>
-      <w:r>
-        <w:t xml:space="preserve">own server.</w:t>
+        <w:t xml:space="preserve">Where the policy lives:</w:t>
+      </w:r>
+      <w:r>
+        <w:t xml:space="preserve"> </w:t>
+      </w:r>
+      <w:r>
+        <w:t xml:space="preserve">you harden the account policy of</w:t>
+      </w:r>
+      <w:r>
+        <w:t xml:space="preserve"> </w:t>
+      </w:r>
+      <w:r>
+        <w:rPr>
+          <w:b/>
+        </w:rPr>
+        <w:t xml:space="preserve">your own pod</w:t>
+      </w:r>
+      <w:r>
+        <w:rPr>
+          <w:b/>
+        </w:rPr>
+        <w:t xml:space="preserve"> </w:t>
+      </w:r>
+      <w:r>
+        <w:rPr>
+          <w:b/>
+        </w:rPr>
+        <w:t xml:space="preserve">server</w:t>
+      </w:r>
+      <w:r>
+        <w:t xml:space="preserve">, which governs the local accounts on that server. The</w:t>
+      </w:r>
+      <w:r>
+        <w:t xml:space="preserve"> </w:t>
+      </w:r>
+      <w:r>
+        <w:rPr>
+          <w:i/>
+        </w:rPr>
+        <w:t xml:space="preserve">domain</w:t>
+      </w:r>
+      <w:r>
+        <w:t xml:space="preserve"> </w:t>
+      </w:r>
+      <w:r>
+        <w:t xml:space="preserve">password policy is shared by all 20 pods and stays with the instructors, so</w:t>
+      </w:r>
+      <w:r>
+        <w:t xml:space="preserve"> </w:t>
+      </w:r>
+      <w:r>
+        <w:t xml:space="preserve">nothing you do here affects anyone else's pod. Work from an elevated session.</w:t>
       </w:r>
     </w:p>
     <w:p>
@@ -7777,36 +7863,7 @@
         <w:pStyle w:val="FirstParagraph"/>
       </w:pPr>
       <w:r>
-        <w:t xml:space="preserve">The domain password policy was dangerously weak: minimum length 6, complexity disabled, and no account lockout.</w:t>
-      </w:r>
-    </w:p>
-    <w:p>
-      <w:pPr>
-        <w:pStyle w:val="BlockText"/>
-      </w:pPr>
-      <w:r>
-        <w:rPr>
-          <w:b/>
-        </w:rPr>
-        <w:t xml:space="preserve">Note:</w:t>
-      </w:r>
-      <w:r>
-        <w:t xml:space="preserve"> </w:t>
-      </w:r>
-      <w:r>
-        <w:t xml:space="preserve">the password policy is</w:t>
-      </w:r>
-      <w:r>
-        <w:t xml:space="preserve"> </w:t>
-      </w:r>
-      <w:r>
-        <w:rPr>
-          <w:b/>
-        </w:rPr>
-        <w:t xml:space="preserve">domain-wide</w:t>
-      </w:r>
-      <w:r>
-        <w:t xml:space="preserve">, shared by every pod — it is the one IA lab whose change is not isolated to your pod.</w:t>
+        <w:t xml:space="preserve">Your server's local account policy is dangerously weak: minimum length 6, complexity disabled, and no account lockout. An attacker who reaches a local account can brute-force it in seconds.</w:t>
       </w:r>
     </w:p>
     <w:p>
@@ -7916,7 +7973,7 @@
               <w:rPr>
                 <w:b/>
               </w:rPr>
-              <w:t xml:space="preserve">12</w:t>
+              <w:t xml:space="preserve">12 or more</w:t>
             </w:r>
           </w:p>
         </w:tc>
@@ -7992,7 +8049,7 @@
               <w:rPr>
                 <w:b/>
               </w:rPr>
-              <w:t xml:space="preserve">10 attempts</w:t>
+              <w:t xml:space="preserve">1–10 invalid attempts</w:t>
             </w:r>
           </w:p>
         </w:tc>
@@ -8019,13 +8076,7 @@
         <w:rPr>
           <w:b/>
         </w:rPr>
-        <w:t xml:space="preserve">Verify the live policy</w:t>
-      </w:r>
-      <w:r>
-        <w:t xml:space="preserve"> </w:t>
-      </w:r>
-      <w:r>
-        <w:t xml:space="preserve">(this is what is graded):</w:t>
+        <w:t xml:space="preserve">Read the policy you start with:</w:t>
       </w:r>
     </w:p>
     <w:p>
@@ -8038,56 +8089,407 @@
       </w:pPr>
       <w:r>
         <w:rPr>
+          <w:rStyle w:val="NormalTok"/>
+        </w:rPr>
+        <w:t xml:space="preserve">net accounts</w:t>
+      </w:r>
+    </w:p>
+    <w:p>
+      <w:pPr>
+        <w:numPr>
+          <w:ilvl w:val="0"/>
+          <w:numId w:val="1042"/>
+        </w:numPr>
+      </w:pPr>
+      <w:r>
+        <w:rPr>
+          <w:b/>
+        </w:rPr>
+        <w:t xml:space="preserve">Harden it — GUI (</w:t>
+      </w:r>
+      <w:r>
+        <w:rPr>
+          <w:rStyle w:val="VerbatimChar"/>
+          <w:b/>
+        </w:rPr>
+        <w:t xml:space="preserve">secpol.msc</w:t>
+      </w:r>
+      <w:r>
+        <w:rPr>
+          <w:b/>
+        </w:rPr>
+        <w:t xml:space="preserve">):</w:t>
+      </w:r>
+    </w:p>
+    <w:p>
+      <w:pPr>
+        <w:numPr>
+          <w:ilvl w:val="1"/>
+          <w:numId w:val="1043"/>
+        </w:numPr>
+        <w:pStyle w:val="Compact"/>
+      </w:pPr>
+      <w:r>
+        <w:t xml:space="preserve">Press</w:t>
+      </w:r>
+      <w:r>
+        <w:t xml:space="preserve"> </w:t>
+      </w:r>
+      <w:r>
+        <w:rPr>
+          <w:b/>
+        </w:rPr>
+        <w:t xml:space="preserve">Windows + R</w:t>
+      </w:r>
+      <w:r>
+        <w:t xml:space="preserve">, type</w:t>
+      </w:r>
+      <w:r>
+        <w:t xml:space="preserve"> </w:t>
+      </w:r>
+      <w:r>
+        <w:rPr>
+          <w:rStyle w:val="VerbatimChar"/>
+        </w:rPr>
+        <w:t xml:space="preserve">secpol.msc</w:t>
+      </w:r>
+      <w:r>
+        <w:t xml:space="preserve">, press Enter (accept the UAC prompt)</w:t>
+      </w:r>
+    </w:p>
+    <w:p>
+      <w:pPr>
+        <w:numPr>
+          <w:ilvl w:val="1"/>
+          <w:numId w:val="1043"/>
+        </w:numPr>
+        <w:pStyle w:val="Compact"/>
+      </w:pPr>
+      <w:r>
+        <w:rPr>
+          <w:b/>
+        </w:rPr>
+        <w:t xml:space="preserve">Account Policies → Password Policy</w:t>
+      </w:r>
+      <w:r>
+        <w:t xml:space="preserve">: set</w:t>
+      </w:r>
+      <w:r>
+        <w:t xml:space="preserve"> </w:t>
+      </w:r>
+      <w:r>
+        <w:rPr>
+          <w:i/>
+        </w:rPr>
+        <w:t xml:space="preserve">Minimum password length</w:t>
+      </w:r>
+      <w:r>
+        <w:t xml:space="preserve"> </w:t>
+      </w:r>
+      <w:r>
+        <w:t xml:space="preserve">to</w:t>
+      </w:r>
+      <w:r>
+        <w:t xml:space="preserve"> </w:t>
+      </w:r>
+      <w:r>
+        <w:rPr>
+          <w:rStyle w:val="VerbatimChar"/>
+        </w:rPr>
+        <w:t xml:space="preserve">12</w:t>
+      </w:r>
+      <w:r>
+        <w:t xml:space="preserve">, and</w:t>
+      </w:r>
+      <w:r>
+        <w:t xml:space="preserve"> </w:t>
+      </w:r>
+      <w:r>
+        <w:rPr>
+          <w:i/>
+        </w:rPr>
+        <w:t xml:space="preserve">Password must meet complexity requirements</w:t>
+      </w:r>
+      <w:r>
+        <w:t xml:space="preserve"> </w:t>
+      </w:r>
+      <w:r>
+        <w:t xml:space="preserve">to</w:t>
+      </w:r>
+      <w:r>
+        <w:t xml:space="preserve"> </w:t>
+      </w:r>
+      <w:r>
+        <w:rPr>
+          <w:b/>
+        </w:rPr>
+        <w:t xml:space="preserve">Enabled</w:t>
+      </w:r>
+    </w:p>
+    <w:p>
+      <w:pPr>
+        <w:numPr>
+          <w:ilvl w:val="1"/>
+          <w:numId w:val="1043"/>
+        </w:numPr>
+        <w:pStyle w:val="Compact"/>
+      </w:pPr>
+      <w:r>
+        <w:rPr>
+          <w:b/>
+        </w:rPr>
+        <w:t xml:space="preserve">Account Policies → Account Lockout Policy</w:t>
+      </w:r>
+      <w:r>
+        <w:t xml:space="preserve">: set</w:t>
+      </w:r>
+      <w:r>
+        <w:t xml:space="preserve"> </w:t>
+      </w:r>
+      <w:r>
+        <w:rPr>
+          <w:i/>
+        </w:rPr>
+        <w:t xml:space="preserve">Account lockout threshold</w:t>
+      </w:r>
+      <w:r>
+        <w:t xml:space="preserve"> </w:t>
+      </w:r>
+      <w:r>
+        <w:t xml:space="preserve">to</w:t>
+      </w:r>
+      <w:r>
+        <w:t xml:space="preserve"> </w:t>
+      </w:r>
+      <w:r>
+        <w:rPr>
+          <w:rStyle w:val="VerbatimChar"/>
+        </w:rPr>
+        <w:t xml:space="preserve">10</w:t>
+      </w:r>
+      <w:r>
+        <w:t xml:space="preserve"> </w:t>
+      </w:r>
+      <w:r>
+        <w:t xml:space="preserve">invalid logon attempts (Windows will offer lockout duration and reset counter defaults — accept them)</w:t>
+      </w:r>
+    </w:p>
+    <w:p>
+      <w:pPr>
+        <w:numPr>
+          <w:ilvl w:val="0"/>
+          <w:numId w:val="1000"/>
+        </w:numPr>
+      </w:pPr>
+      <w:r>
+        <w:rPr>
+          <w:b/>
+        </w:rPr>
+        <w:t xml:space="preserve">PowerShell alternative</w:t>
+      </w:r>
+      <w:r>
+        <w:t xml:space="preserve"> </w:t>
+      </w:r>
+      <w:r>
+        <w:t xml:space="preserve">(run elevated; complexity has no</w:t>
+      </w:r>
+      <w:r>
+        <w:t xml:space="preserve"> </w:t>
+      </w:r>
+      <w:r>
+        <w:rPr>
+          <w:rStyle w:val="VerbatimChar"/>
+        </w:rPr>
+        <w:t xml:space="preserve">net accounts</w:t>
+      </w:r>
+      <w:r>
+        <w:t xml:space="preserve"> </w:t>
+      </w:r>
+      <w:r>
+        <w:t xml:space="preserve">switch, so it is set through the security database):</w:t>
+      </w:r>
+    </w:p>
+    <w:p>
+      <w:pPr>
+        <w:numPr>
+          <w:ilvl w:val="0"/>
+          <w:numId w:val="1000"/>
+        </w:numPr>
+        <w:pStyle w:val="SourceCode"/>
+      </w:pPr>
+      <w:r>
+        <w:rPr>
+          <w:rStyle w:val="NormalTok"/>
+        </w:rPr>
+        <w:t xml:space="preserve">net accounts /minpwlen:12 /lockoutthreshold:10 /uniquepw:24</w:t>
+      </w:r>
+      <w:r>
+        <w:br/>
+      </w:r>
+      <w:r>
+        <w:br/>
+      </w:r>
+      <w:r>
+        <w:rPr>
+          <w:rStyle w:val="VariableTok"/>
+        </w:rPr>
+        <w:t xml:space="preserve">$inf</w:t>
+      </w:r>
+      <w:r>
+        <w:rPr>
+          <w:rStyle w:val="NormalTok"/>
+        </w:rPr>
+        <w:t xml:space="preserve"> = </w:t>
+      </w:r>
+      <w:r>
+        <w:rPr>
+          <w:rStyle w:val="StringTok"/>
+        </w:rPr>
+        <w:t xml:space="preserve">"$env:TEMP\pwpolicy.inf"</w:t>
+      </w:r>
+      <w:r>
+        <w:br/>
+      </w:r>
+      <w:r>
+        <w:rPr>
+          <w:rStyle w:val="NormalTok"/>
+        </w:rPr>
+        <w:t xml:space="preserve">@'</w:t>
+      </w:r>
+      <w:r>
+        <w:br/>
+      </w:r>
+      <w:r>
+        <w:rPr>
+          <w:rStyle w:val="NormalTok"/>
+        </w:rPr>
+        <w:t xml:space="preserve">[Unicode]</w:t>
+      </w:r>
+      <w:r>
+        <w:br/>
+      </w:r>
+      <w:r>
+        <w:rPr>
+          <w:rStyle w:val="NormalTok"/>
+        </w:rPr>
+        <w:t xml:space="preserve">Unicode=yes</w:t>
+      </w:r>
+      <w:r>
+        <w:br/>
+      </w:r>
+      <w:r>
+        <w:rPr>
+          <w:rStyle w:val="NormalTok"/>
+        </w:rPr>
+        <w:t xml:space="preserve">[Version]</w:t>
+      </w:r>
+      <w:r>
+        <w:br/>
+      </w:r>
+      <w:r>
+        <w:rPr>
+          <w:rStyle w:val="NormalTok"/>
+        </w:rPr>
+        <w:t xml:space="preserve">signature=</w:t>
+      </w:r>
+      <w:r>
+        <w:rPr>
+          <w:rStyle w:val="StringTok"/>
+        </w:rPr>
+        <w:t xml:space="preserve">"$CHICAGO$"</w:t>
+      </w:r>
+      <w:r>
+        <w:br/>
+      </w:r>
+      <w:r>
+        <w:rPr>
+          <w:rStyle w:val="NormalTok"/>
+        </w:rPr>
+        <w:t xml:space="preserve">Revision=1</w:t>
+      </w:r>
+      <w:r>
+        <w:br/>
+      </w:r>
+      <w:r>
+        <w:rPr>
+          <w:rStyle w:val="NormalTok"/>
+        </w:rPr>
+        <w:t xml:space="preserve">[System Access]</w:t>
+      </w:r>
+      <w:r>
+        <w:br/>
+      </w:r>
+      <w:r>
+        <w:rPr>
+          <w:rStyle w:val="NormalTok"/>
+        </w:rPr>
+        <w:t xml:space="preserve">PasswordComplexity = 1</w:t>
+      </w:r>
+      <w:r>
+        <w:br/>
+      </w:r>
+      <w:r>
+        <w:rPr>
+          <w:rStyle w:val="NormalTok"/>
+        </w:rPr>
+        <w:t xml:space="preserve">'@ | </w:t>
+      </w:r>
+      <w:r>
+        <w:rPr>
           <w:rStyle w:val="FunctionTok"/>
         </w:rPr>
-        <w:t xml:space="preserve">Get-ADDefaultDomainPasswordPolicy</w:t>
+        <w:t xml:space="preserve">Set-Content</w:t>
       </w:r>
       <w:r>
         <w:rPr>
           <w:rStyle w:val="NormalTok"/>
         </w:rPr>
-        <w:t xml:space="preserve"> | </w:t>
-      </w:r>
-      <w:r>
-        <w:rPr>
-          <w:rStyle w:val="FunctionTok"/>
-        </w:rPr>
-        <w:t xml:space="preserve">Select-Object</w:t>
+        <w:t xml:space="preserve"> -LiteralPath </w:t>
+      </w:r>
+      <w:r>
+        <w:rPr>
+          <w:rStyle w:val="VariableTok"/>
+        </w:rPr>
+        <w:t xml:space="preserve">$inf</w:t>
       </w:r>
       <w:r>
         <w:rPr>
           <w:rStyle w:val="NormalTok"/>
         </w:rPr>
-        <w:t xml:space="preserve"> MinPasswordLength, ComplexityEnabled, LockoutThreshold, PasswordHistoryCount, MaxPasswordAge, MinPasswordAge</w:t>
-      </w:r>
-    </w:p>
-    <w:p>
-      <w:pPr>
-        <w:numPr>
-          <w:ilvl w:val="0"/>
-          <w:numId w:val="1000"/>
-        </w:numPr>
-      </w:pPr>
-      <w:r>
-        <w:t xml:space="preserve">Confirm minimum length 12, complexity</w:t>
-      </w:r>
-      <w:r>
-        <w:t xml:space="preserve"> </w:t>
-      </w:r>
-      <w:r>
-        <w:rPr>
-          <w:rStyle w:val="VerbatimChar"/>
-        </w:rPr>
-        <w:t xml:space="preserve">True</w:t>
-      </w:r>
-      <w:r>
-        <w:t xml:space="preserve">, and lockout threshold 10 — then</w:t>
-      </w:r>
-      <w:r>
-        <w:t xml:space="preserve"> </w:t>
-      </w:r>
-      <w:r>
-        <w:t xml:space="preserve">note in your own words which weakness each setting removes.</w:t>
+        <w:t xml:space="preserve"> -Encoding Unicode</w:t>
+      </w:r>
+      <w:r>
+        <w:br/>
+      </w:r>
+      <w:r>
+        <w:rPr>
+          <w:rStyle w:val="NormalTok"/>
+        </w:rPr>
+        <w:t xml:space="preserve">secedit /configure /db </w:t>
+      </w:r>
+      <w:r>
+        <w:rPr>
+          <w:rStyle w:val="StringTok"/>
+        </w:rPr>
+        <w:t xml:space="preserve">"$env:TEMP\pwpolicy.sdb"</w:t>
+      </w:r>
+      <w:r>
+        <w:rPr>
+          <w:rStyle w:val="NormalTok"/>
+        </w:rPr>
+        <w:t xml:space="preserve"> /cfg </w:t>
+      </w:r>
+      <w:r>
+        <w:rPr>
+          <w:rStyle w:val="VariableTok"/>
+        </w:rPr>
+        <w:t xml:space="preserve">$inf</w:t>
+      </w:r>
+      <w:r>
+        <w:rPr>
+          <w:rStyle w:val="NormalTok"/>
+        </w:rPr>
+        <w:t xml:space="preserve"> /areas SECURITYPOLICY</w:t>
       </w:r>
     </w:p>
     <w:p>
@@ -8101,243 +8503,61 @@
         <w:rPr>
           <w:b/>
         </w:rPr>
-        <w:t xml:space="preserve">Reference — how the policy is applied</w:t>
-      </w:r>
-      <w:r>
-        <w:t xml:space="preserve"> </w:t>
-      </w:r>
-      <w:r>
-        <w:t xml:space="preserve">(administrator step, do not attempt this cohort):</w:t>
-      </w:r>
-    </w:p>
-    <w:p>
-      <w:pPr>
-        <w:numPr>
-          <w:ilvl w:val="0"/>
-          <w:numId w:val="1000"/>
-        </w:numPr>
-        <w:pStyle w:val="SourceCode"/>
-      </w:pPr>
-      <w:r>
-        <w:rPr>
-          <w:rStyle w:val="FunctionTok"/>
-        </w:rPr>
-        <w:t xml:space="preserve">Set-ADDefaultDomainPasswordPolicy</w:t>
-      </w:r>
-      <w:r>
-        <w:rPr>
-          <w:rStyle w:val="NormalTok"/>
-        </w:rPr>
-        <w:t xml:space="preserve"> -Identity (</w:t>
-      </w:r>
-      <w:r>
-        <w:rPr>
-          <w:rStyle w:val="FunctionTok"/>
-        </w:rPr>
-        <w:t xml:space="preserve">Get-ADDomain</w:t>
-      </w:r>
-      <w:r>
-        <w:rPr>
-          <w:rStyle w:val="NormalTok"/>
-        </w:rPr>
-        <w:t xml:space="preserve">).</w:t>
-      </w:r>
-      <w:r>
-        <w:rPr>
-          <w:rStyle w:val="FunctionTok"/>
-        </w:rPr>
-        <w:t xml:space="preserve">DNSRoot</w:t>
-      </w:r>
-      <w:r>
-        <w:rPr>
-          <w:rStyle w:val="NormalTok"/>
-        </w:rPr>
-        <w:t xml:space="preserve"> `</w:t>
-      </w:r>
-      <w:r>
-        <w:br/>
-      </w:r>
-      <w:r>
-        <w:rPr>
-          <w:rStyle w:val="NormalTok"/>
-        </w:rPr>
-        <w:t xml:space="preserve">    -MinPasswordLength 12 `</w:t>
-      </w:r>
-      <w:r>
-        <w:br/>
-      </w:r>
-      <w:r>
-        <w:rPr>
-          <w:rStyle w:val="NormalTok"/>
-        </w:rPr>
-        <w:t xml:space="preserve">    -ComplexityEnabled </w:t>
-      </w:r>
-      <w:r>
-        <w:rPr>
-          <w:rStyle w:val="VariableTok"/>
-        </w:rPr>
-        <w:t xml:space="preserve">$true</w:t>
-      </w:r>
-      <w:r>
-        <w:rPr>
-          <w:rStyle w:val="NormalTok"/>
-        </w:rPr>
-        <w:t xml:space="preserve"> `</w:t>
-      </w:r>
-      <w:r>
-        <w:br/>
-      </w:r>
-      <w:r>
-        <w:rPr>
-          <w:rStyle w:val="NormalTok"/>
-        </w:rPr>
-        <w:t xml:space="preserve">    -LockoutThreshold 10 `</w:t>
-      </w:r>
-      <w:r>
-        <w:br/>
-      </w:r>
-      <w:r>
-        <w:rPr>
-          <w:rStyle w:val="NormalTok"/>
-        </w:rPr>
-        <w:t xml:space="preserve">    -PasswordHistoryCount 24 `</w:t>
-      </w:r>
-      <w:r>
-        <w:br/>
-      </w:r>
-      <w:r>
-        <w:rPr>
-          <w:rStyle w:val="NormalTok"/>
-        </w:rPr>
-        <w:t xml:space="preserve">    -MaxPasswordAge (</w:t>
-      </w:r>
-      <w:r>
-        <w:rPr>
-          <w:rStyle w:val="FunctionTok"/>
-        </w:rPr>
-        <w:t xml:space="preserve">New-TimeSpan</w:t>
-      </w:r>
-      <w:r>
-        <w:rPr>
-          <w:rStyle w:val="NormalTok"/>
-        </w:rPr>
-        <w:t xml:space="preserve"> -Days 90) `</w:t>
-      </w:r>
-      <w:r>
-        <w:br/>
-      </w:r>
-      <w:r>
-        <w:rPr>
-          <w:rStyle w:val="NormalTok"/>
-        </w:rPr>
-        <w:t xml:space="preserve">    -MinPasswordAge (</w:t>
-      </w:r>
-      <w:r>
-        <w:rPr>
-          <w:rStyle w:val="FunctionTok"/>
-        </w:rPr>
-        <w:t xml:space="preserve">New-TimeSpan</w:t>
-      </w:r>
-      <w:r>
-        <w:rPr>
-          <w:rStyle w:val="NormalTok"/>
-        </w:rPr>
-        <w:t xml:space="preserve"> -Days 1)</w:t>
-      </w:r>
-      <w:r>
-        <w:br/>
-      </w:r>
-      <w:r>
-        <w:br/>
-      </w:r>
-      <w:r>
-        <w:rPr>
-          <w:rStyle w:val="NormalTok"/>
-        </w:rPr>
-        <w:t xml:space="preserve">gpupdate /force</w:t>
-      </w:r>
-    </w:p>
-    <w:p>
-      <w:pPr>
-        <w:numPr>
-          <w:ilvl w:val="0"/>
-          <w:numId w:val="1000"/>
-        </w:numPr>
-      </w:pPr>
-      <w:r>
-        <w:t xml:space="preserve">The equivalent GUI path is</w:t>
-      </w:r>
-      <w:r>
-        <w:t xml:space="preserve"> </w:t>
-      </w:r>
-      <w:r>
-        <w:rPr>
-          <w:rStyle w:val="VerbatimChar"/>
-        </w:rPr>
-        <w:t xml:space="preserve">gpmc.msc</w:t>
-      </w:r>
-      <w:r>
-        <w:t xml:space="preserve"> </w:t>
-      </w:r>
-      <w:r>
-        <w:t xml:space="preserve">→</w:t>
-      </w:r>
-      <w:r>
-        <w:t xml:space="preserve"> </w:t>
-      </w:r>
-      <w:r>
-        <w:rPr>
-          <w:b/>
-        </w:rPr>
-        <w:t xml:space="preserve">Forest → Domains → acs-p01.local →</w:t>
-      </w:r>
-      <w:r>
-        <w:rPr>
-          <w:b/>
-        </w:rPr>
-        <w:t xml:space="preserve"> </w:t>
-      </w:r>
-      <w:r>
-        <w:rPr>
-          <w:b/>
-        </w:rPr>
-        <w:t xml:space="preserve">Default Domain Policy</w:t>
-      </w:r>
-      <w:r>
-        <w:t xml:space="preserve"> </w:t>
-      </w:r>
-      <w:r>
-        <w:t xml:space="preserve">→</w:t>
-      </w:r>
-      <w:r>
-        <w:t xml:space="preserve"> </w:t>
-      </w:r>
-      <w:r>
-        <w:rPr>
-          <w:b/>
-        </w:rPr>
-        <w:t xml:space="preserve">Computer Configuration → Policies → Windows</w:t>
-      </w:r>
-      <w:r>
-        <w:rPr>
-          <w:b/>
-        </w:rPr>
-        <w:t xml:space="preserve"> </w:t>
-      </w:r>
-      <w:r>
-        <w:rPr>
-          <w:b/>
-        </w:rPr>
-        <w:t xml:space="preserve">Settings → Security Settings → Account Policies</w:t>
-      </w:r>
-      <w:r>
-        <w:t xml:space="preserve">, setting minimum password</w:t>
-      </w:r>
-      <w:r>
-        <w:t xml:space="preserve"> </w:t>
-      </w:r>
-      <w:r>
-        <w:t xml:space="preserve">length, complexity, and the lockout threshold.</w:t>
+        <w:t xml:space="preserve">Confirm your work</w:t>
+      </w:r>
+      <w:r>
+        <w:t xml:space="preserve"> </w:t>
+      </w:r>
+      <w:r>
+        <w:t xml:space="preserve">—</w:t>
+      </w:r>
+      <w:r>
+        <w:t xml:space="preserve"> </w:t>
+      </w:r>
+      <w:r>
+        <w:rPr>
+          <w:rStyle w:val="VerbatimChar"/>
+        </w:rPr>
+        <w:t xml:space="preserve">net accounts</w:t>
+      </w:r>
+      <w:r>
+        <w:t xml:space="preserve"> </w:t>
+      </w:r>
+      <w:r>
+        <w:t xml:space="preserve">should now report minimum length 12 and</w:t>
+      </w:r>
+      <w:r>
+        <w:t xml:space="preserve"> </w:t>
+      </w:r>
+      <w:r>
+        <w:t xml:space="preserve">a lockout threshold of 10, and</w:t>
+      </w:r>
+      <w:r>
+        <w:t xml:space="preserve"> </w:t>
+      </w:r>
+      <w:r>
+        <w:rPr>
+          <w:rStyle w:val="VerbatimChar"/>
+        </w:rPr>
+        <w:t xml:space="preserve">secedit /export /cfg "$env:TEMP\now.cfg"</w:t>
+      </w:r>
+      <w:r>
+        <w:t xml:space="preserve"> </w:t>
+      </w:r>
+      <w:r>
+        <w:t xml:space="preserve">should show</w:t>
+      </w:r>
+      <w:r>
+        <w:t xml:space="preserve"> </w:t>
+      </w:r>
+      <w:r>
+        <w:rPr>
+          <w:rStyle w:val="VerbatimChar"/>
+        </w:rPr>
+        <w:t xml:space="preserve">PasswordComplexity = 1</w:t>
+      </w:r>
+      <w:r>
+        <w:t xml:space="preserve">.</w:t>
       </w:r>
     </w:p>
     <w:p>
@@ -8354,90 +8574,36 @@
       <w:pPr>
         <w:numPr>
           <w:ilvl w:val="0"/>
-          <w:numId w:val="1043"/>
+          <w:numId w:val="1044"/>
         </w:numPr>
         <w:pStyle w:val="Compact"/>
       </w:pPr>
       <w:r>
-        <w:t xml:space="preserve">☐</w:t>
-      </w:r>
-      <w:r>
-        <w:t xml:space="preserve"> </w:t>
-      </w:r>
-      <w:r>
-        <w:rPr>
-          <w:rStyle w:val="VerbatimChar"/>
-        </w:rPr>
-        <w:t xml:space="preserve">MinPasswordLength</w:t>
-      </w:r>
-      <w:r>
-        <w:t xml:space="preserve"> </w:t>
-      </w:r>
-      <w:r>
-        <w:t xml:space="preserve">is 12 or more</w:t>
-      </w:r>
-    </w:p>
-    <w:p>
-      <w:pPr>
-        <w:numPr>
-          <w:ilvl w:val="0"/>
-          <w:numId w:val="1043"/>
+        <w:t xml:space="preserve">☐ Minimum password length on your pod server is 12 or more</w:t>
+      </w:r>
+    </w:p>
+    <w:p>
+      <w:pPr>
+        <w:numPr>
+          <w:ilvl w:val="0"/>
+          <w:numId w:val="1044"/>
         </w:numPr>
         <w:pStyle w:val="Compact"/>
       </w:pPr>
       <w:r>
-        <w:t xml:space="preserve">☐</w:t>
-      </w:r>
-      <w:r>
-        <w:t xml:space="preserve"> </w:t>
-      </w:r>
-      <w:r>
-        <w:rPr>
-          <w:rStyle w:val="VerbatimChar"/>
-        </w:rPr>
-        <w:t xml:space="preserve">ComplexityEnabled</w:t>
-      </w:r>
-      <w:r>
-        <w:t xml:space="preserve"> </w:t>
-      </w:r>
-      <w:r>
-        <w:t xml:space="preserve">is</w:t>
-      </w:r>
-      <w:r>
-        <w:t xml:space="preserve"> </w:t>
-      </w:r>
-      <w:r>
-        <w:rPr>
-          <w:rStyle w:val="VerbatimChar"/>
-        </w:rPr>
-        <w:t xml:space="preserve">True</w:t>
-      </w:r>
-    </w:p>
-    <w:p>
-      <w:pPr>
-        <w:numPr>
-          <w:ilvl w:val="0"/>
-          <w:numId w:val="1043"/>
+        <w:t xml:space="preserve">☐ Password complexity is enabled</w:t>
+      </w:r>
+    </w:p>
+    <w:p>
+      <w:pPr>
+        <w:numPr>
+          <w:ilvl w:val="0"/>
+          <w:numId w:val="1044"/>
         </w:numPr>
         <w:pStyle w:val="Compact"/>
       </w:pPr>
       <w:r>
-        <w:t xml:space="preserve">☐</w:t>
-      </w:r>
-      <w:r>
-        <w:t xml:space="preserve"> </w:t>
-      </w:r>
-      <w:r>
-        <w:rPr>
-          <w:rStyle w:val="VerbatimChar"/>
-        </w:rPr>
-        <w:t xml:space="preserve">LockoutThreshold</w:t>
-      </w:r>
-      <w:r>
-        <w:t xml:space="preserve"> </w:t>
-      </w:r>
-      <w:r>
-        <w:t xml:space="preserve">is 10 or more</w:t>
+        <w:t xml:space="preserve">☐ Account lockout threshold is between 1 and 10 invalid attempts</w:t>
       </w:r>
     </w:p>
     <w:p>
@@ -8455,7 +8621,7 @@
         <w:pStyle w:val="FirstParagraph"/>
       </w:pPr>
       <w:r>
-        <w:t xml:space="preserve">A 6-character password with no complexity and no lockout can be brute-forced in seconds. IA.L1-3.5.2 requires authentication that actually resists common attacks.</w:t>
+        <w:t xml:space="preserve">A 6-character password with no complexity and no lockout can be brute-forced in seconds. IA.L1-3.5.2 requires authentication that actually resists common attacks — on every system in scope, not just the domain.</w:t>
       </w:r>
     </w:p>
     <w:p>
@@ -8563,7 +8729,7 @@
       <w:pPr>
         <w:numPr>
           <w:ilvl w:val="0"/>
-          <w:numId w:val="1044"/>
+          <w:numId w:val="1045"/>
         </w:numPr>
         <w:pStyle w:val="Compact"/>
       </w:pPr>
@@ -8584,7 +8750,7 @@
       <w:pPr>
         <w:numPr>
           <w:ilvl w:val="0"/>
-          <w:numId w:val="1044"/>
+          <w:numId w:val="1045"/>
         </w:numPr>
         <w:pStyle w:val="Compact"/>
       </w:pPr>
@@ -8606,7 +8772,7 @@
       <w:pPr>
         <w:numPr>
           <w:ilvl w:val="0"/>
-          <w:numId w:val="1045"/>
+          <w:numId w:val="1046"/>
         </w:numPr>
       </w:pPr>
       <w:r>
@@ -8799,7 +8965,7 @@
       <w:pPr>
         <w:numPr>
           <w:ilvl w:val="0"/>
-          <w:numId w:val="1045"/>
+          <w:numId w:val="1046"/>
         </w:numPr>
       </w:pPr>
       <w:r>
@@ -8861,7 +9027,7 @@
       <w:pPr>
         <w:numPr>
           <w:ilvl w:val="0"/>
-          <w:numId w:val="1045"/>
+          <w:numId w:val="1046"/>
         </w:numPr>
       </w:pPr>
       <w:r>
@@ -8963,7 +9129,7 @@
       <w:pPr>
         <w:numPr>
           <w:ilvl w:val="0"/>
-          <w:numId w:val="1046"/>
+          <w:numId w:val="1047"/>
         </w:numPr>
         <w:pStyle w:val="Compact"/>
       </w:pPr>
@@ -8999,7 +9165,7 @@
       <w:pPr>
         <w:numPr>
           <w:ilvl w:val="0"/>
-          <w:numId w:val="1046"/>
+          <w:numId w:val="1047"/>
         </w:numPr>
         <w:pStyle w:val="Compact"/>
       </w:pPr>
@@ -9163,7 +9329,7 @@
       <w:pPr>
         <w:numPr>
           <w:ilvl w:val="0"/>
-          <w:numId w:val="1047"/>
+          <w:numId w:val="1048"/>
         </w:numPr>
         <w:pStyle w:val="Compact"/>
       </w:pPr>
@@ -9175,7 +9341,7 @@
       <w:pPr>
         <w:numPr>
           <w:ilvl w:val="0"/>
-          <w:numId w:val="1047"/>
+          <w:numId w:val="1048"/>
         </w:numPr>
         <w:pStyle w:val="Compact"/>
       </w:pPr>
@@ -9187,7 +9353,7 @@
       <w:pPr>
         <w:numPr>
           <w:ilvl w:val="0"/>
-          <w:numId w:val="1047"/>
+          <w:numId w:val="1048"/>
         </w:numPr>
         <w:pStyle w:val="Compact"/>
       </w:pPr>
@@ -9209,7 +9375,7 @@
       <w:pPr>
         <w:numPr>
           <w:ilvl w:val="0"/>
-          <w:numId w:val="1048"/>
+          <w:numId w:val="1049"/>
         </w:numPr>
       </w:pPr>
       <w:r>
@@ -9238,7 +9404,7 @@
       <w:pPr>
         <w:numPr>
           <w:ilvl w:val="0"/>
-          <w:numId w:val="1048"/>
+          <w:numId w:val="1049"/>
         </w:numPr>
       </w:pPr>
       <w:r>
@@ -9386,7 +9552,7 @@
       <w:pPr>
         <w:numPr>
           <w:ilvl w:val="0"/>
-          <w:numId w:val="1048"/>
+          <w:numId w:val="1049"/>
         </w:numPr>
       </w:pPr>
       <w:r>
@@ -9488,7 +9654,7 @@
       <w:pPr>
         <w:numPr>
           <w:ilvl w:val="0"/>
-          <w:numId w:val="1049"/>
+          <w:numId w:val="1050"/>
         </w:numPr>
         <w:pStyle w:val="Compact"/>
       </w:pPr>
@@ -9515,7 +9681,7 @@
       <w:pPr>
         <w:numPr>
           <w:ilvl w:val="0"/>
-          <w:numId w:val="1049"/>
+          <w:numId w:val="1050"/>
         </w:numPr>
         <w:pStyle w:val="Compact"/>
       </w:pPr>
@@ -9667,7 +9833,7 @@
       <w:pPr>
         <w:numPr>
           <w:ilvl w:val="0"/>
-          <w:numId w:val="1050"/>
+          <w:numId w:val="1051"/>
         </w:numPr>
         <w:pStyle w:val="Compact"/>
       </w:pPr>
@@ -9679,7 +9845,7 @@
       <w:pPr>
         <w:numPr>
           <w:ilvl w:val="0"/>
-          <w:numId w:val="1050"/>
+          <w:numId w:val="1051"/>
         </w:numPr>
         <w:pStyle w:val="Compact"/>
       </w:pPr>
@@ -9691,7 +9857,7 @@
       <w:pPr>
         <w:numPr>
           <w:ilvl w:val="0"/>
-          <w:numId w:val="1050"/>
+          <w:numId w:val="1051"/>
         </w:numPr>
         <w:pStyle w:val="Compact"/>
       </w:pPr>
@@ -9713,7 +9879,7 @@
       <w:pPr>
         <w:numPr>
           <w:ilvl w:val="0"/>
-          <w:numId w:val="1051"/>
+          <w:numId w:val="1052"/>
         </w:numPr>
       </w:pPr>
       <w:r>
@@ -9736,158 +9902,332 @@
       <w:pPr>
         <w:numPr>
           <w:ilvl w:val="1"/>
+          <w:numId w:val="1053"/>
+        </w:numPr>
+        <w:pStyle w:val="Compact"/>
+      </w:pPr>
+      <w:r>
+        <w:t xml:space="preserve">The</w:t>
+      </w:r>
+      <w:r>
+        <w:t xml:space="preserve"> </w:t>
+      </w:r>
+      <w:r>
+        <w:rPr>
+          <w:rStyle w:val="VerbatimChar"/>
+        </w:rPr>
+        <w:t xml:space="preserve">[HIGH]</w:t>
+      </w:r>
+      <w:r>
+        <w:t xml:space="preserve"> </w:t>
+      </w:r>
+      <w:r>
+        <w:t xml:space="preserve">finding is SNMP community string</w:t>
+      </w:r>
+      <w:r>
+        <w:t xml:space="preserve"> </w:t>
+      </w:r>
+      <w:r>
+        <w:rPr>
+          <w:rStyle w:val="VerbatimChar"/>
+        </w:rPr>
+        <w:t xml:space="preserve">public</w:t>
+      </w:r>
+      <w:r>
+        <w:t xml:space="preserve"> </w:t>
+      </w:r>
+      <w:r>
+        <w:t xml:space="preserve">on</w:t>
+      </w:r>
+      <w:r>
+        <w:t xml:space="preserve"> </w:t>
+      </w:r>
+      <w:r>
+        <w:rPr>
+          <w:b/>
+        </w:rPr>
+        <w:t xml:space="preserve">10.50.1.30 (PRINT-P01)</w:t>
+      </w:r>
+      <w:r>
+        <w:t xml:space="preserve">, port 161/udp</w:t>
+      </w:r>
+    </w:p>
+    <w:p>
+      <w:pPr>
+        <w:numPr>
+          <w:ilvl w:val="0"/>
           <w:numId w:val="1052"/>
         </w:numPr>
+      </w:pPr>
+      <w:r>
+        <w:rPr>
+          <w:b/>
+        </w:rPr>
+        <w:t xml:space="preserve">Append the finding to</w:t>
+      </w:r>
+      <w:r>
+        <w:rPr>
+          <w:b/>
+        </w:rPr>
+        <w:t xml:space="preserve"> </w:t>
+      </w:r>
+      <w:r>
+        <w:rPr>
+          <w:rStyle w:val="VerbatimChar"/>
+          <w:b/>
+        </w:rPr>
+        <w:t xml:space="preserve">C:\CyberLab\PodXX\IA-Artifacts\Device_Config_Record.csv</w:t>
+      </w:r>
+      <w:r>
+        <w:rPr>
+          <w:b/>
+        </w:rPr>
+        <w:t xml:space="preserve">.</w:t>
+      </w:r>
+    </w:p>
+    <w:p>
+      <w:pPr>
+        <w:numPr>
+          <w:ilvl w:val="0"/>
+          <w:numId w:val="1000"/>
+        </w:numPr>
+        <w:pStyle w:val="BlockText"/>
+      </w:pPr>
+      <w:r>
+        <w:rPr>
+          <w:b/>
+        </w:rPr>
+        <w:t xml:space="preserve">Do not overwrite this file</w:t>
+      </w:r>
+      <w:r>
+        <w:t xml:space="preserve"> </w:t>
+      </w:r>
+      <w:r>
+        <w:t xml:space="preserve">— it still has to contain your M2-L2 rogue-device row (</w:t>
+      </w:r>
+      <w:r>
+        <w:rPr>
+          <w:rStyle w:val="VerbatimChar"/>
+        </w:rPr>
+        <w:t xml:space="preserve">AA-BB-CC-11-22-33</w:t>
+      </w:r>
+      <w:r>
+        <w:t xml:space="preserve"> </w:t>
+      </w:r>
+      <w:r>
+        <w:t xml:space="preserve">/</w:t>
+      </w:r>
+      <w:r>
+        <w:t xml:space="preserve"> </w:t>
+      </w:r>
+      <w:r>
+        <w:rPr>
+          <w:rStyle w:val="VerbatimChar"/>
+        </w:rPr>
+        <w:t xml:space="preserve">UNAUTHORIZED</w:t>
+      </w:r>
+      <w:r>
+        <w:t xml:space="preserve">) or M2-L2 will fail. Open it in Notepad and add a line at the end, for example:</w:t>
+      </w:r>
+    </w:p>
+    <w:p>
+      <w:pPr>
+        <w:numPr>
+          <w:ilvl w:val="0"/>
+          <w:numId w:val="1000"/>
+        </w:numPr>
+        <w:pStyle w:val="SourceCode"/>
+      </w:pPr>
+      <w:r>
+        <w:rPr>
+          <w:rStyle w:val="VerbatimChar"/>
+        </w:rPr>
+        <w:t xml:space="preserve">10.50.1.30,PRINT-P01,SNMP community string is 'public' (HIGH) - change to a complex value and restrict SNMP,OPEN,Network scan,From openvas_scan_report.txt</w:t>
+      </w:r>
+    </w:p>
+    <w:p>
+      <w:pPr>
+        <w:numPr>
+          <w:ilvl w:val="0"/>
+          <w:numId w:val="1000"/>
+        </w:numPr>
+      </w:pPr>
+      <w:r>
+        <w:t xml:space="preserve">Keeping both findings in one file is what the checker expects: the file must mention</w:t>
+      </w:r>
+      <w:r>
+        <w:t xml:space="preserve"> </w:t>
+      </w:r>
+      <w:r>
+        <w:rPr>
+          <w:rStyle w:val="VerbatimChar"/>
+        </w:rPr>
+        <w:t xml:space="preserve">SNMP</w:t>
+      </w:r>
+      <w:r>
+        <w:t xml:space="preserve"> </w:t>
+      </w:r>
+      <w:r>
+        <w:t xml:space="preserve">(M4-L2)</w:t>
+      </w:r>
+      <w:r>
+        <w:t xml:space="preserve"> </w:t>
+      </w:r>
+      <w:r>
+        <w:rPr>
+          <w:b/>
+        </w:rPr>
+        <w:t xml:space="preserve">and</w:t>
+      </w:r>
+      <w:r>
+        <w:t xml:space="preserve"> </w:t>
+      </w:r>
+      <w:r>
+        <w:t xml:space="preserve">the rogue MAC marked</w:t>
+      </w:r>
+      <w:r>
+        <w:t xml:space="preserve"> </w:t>
+      </w:r>
+      <w:r>
+        <w:rPr>
+          <w:rStyle w:val="VerbatimChar"/>
+        </w:rPr>
+        <w:t xml:space="preserve">UNAUTHORIZED</w:t>
+      </w:r>
+      <w:r>
+        <w:t xml:space="preserve"> </w:t>
+      </w:r>
+      <w:r>
+        <w:t xml:space="preserve">must still be in</w:t>
+      </w:r>
+      <w:r>
+        <w:t xml:space="preserve"> </w:t>
+      </w:r>
+      <w:r>
+        <w:rPr>
+          <w:rStyle w:val="VerbatimChar"/>
+        </w:rPr>
+        <w:t xml:space="preserve">Authorized_Device_List.csv</w:t>
+      </w:r>
+      <w:r>
+        <w:t xml:space="preserve"> </w:t>
+      </w:r>
+      <w:r>
+        <w:t xml:space="preserve">(M2-L2).</w:t>
+      </w:r>
+    </w:p>
+    <w:p>
+      <w:pPr>
+        <w:numPr>
+          <w:ilvl w:val="0"/>
+          <w:numId w:val="1052"/>
+        </w:numPr>
+      </w:pPr>
+      <w:r>
+        <w:rPr>
+          <w:b/>
+        </w:rPr>
+        <w:t xml:space="preserve">Add an SNMP clause</w:t>
+      </w:r>
+      <w:r>
+        <w:t xml:space="preserve"> </w:t>
+      </w:r>
+      <w:r>
+        <w:t xml:space="preserve">to</w:t>
+      </w:r>
+      <w:r>
+        <w:t xml:space="preserve"> </w:t>
+      </w:r>
+      <w:r>
+        <w:rPr>
+          <w:rStyle w:val="VerbatimChar"/>
+        </w:rPr>
+        <w:t xml:space="preserve">Hardening_Standard.txt</w:t>
+      </w:r>
+      <w:r>
+        <w:t xml:space="preserve"> </w:t>
+      </w:r>
+      <w:r>
+        <w:t xml:space="preserve">(good practice, and it reinforces M4-L1):</w:t>
+      </w:r>
+    </w:p>
+    <w:p>
+      <w:pPr>
+        <w:numPr>
+          <w:ilvl w:val="0"/>
+          <w:numId w:val="1000"/>
+        </w:numPr>
+        <w:pStyle w:val="SourceCode"/>
+      </w:pPr>
+      <w:r>
+        <w:rPr>
+          <w:rStyle w:val="VerbatimChar"/>
+        </w:rPr>
+        <w:t xml:space="preserve">7. SNMP CONFIGURATION</w:t>
+      </w:r>
+      <w:r>
+        <w:br/>
+      </w:r>
+      <w:r>
+        <w:rPr>
+          <w:rStyle w:val="VerbatimChar"/>
+        </w:rPr>
+        <w:t xml:space="preserve">   - Default SNMP community strings (public, private) must be changed on all</w:t>
+      </w:r>
+      <w:r>
+        <w:br/>
+      </w:r>
+      <w:r>
+        <w:rPr>
+          <w:rStyle w:val="VerbatimChar"/>
+        </w:rPr>
+        <w:t xml:space="preserve">     network devices. Use SNMPv3 with authentication and encryption where</w:t>
+      </w:r>
+      <w:r>
+        <w:br/>
+      </w:r>
+      <w:r>
+        <w:rPr>
+          <w:rStyle w:val="VerbatimChar"/>
+        </w:rPr>
+        <w:t xml:space="preserve">     supported. SNMP v1/v2c with default strings is a critical finding.</w:t>
+      </w:r>
+    </w:p>
+    <w:p>
+      <w:pPr>
+        <w:pStyle w:val="Heading4"/>
+      </w:pPr>
+      <w:bookmarkStart w:id="105" w:name="completion-criteria-10"/>
+      <w:r>
+        <w:t xml:space="preserve">Completion Criteria</w:t>
+      </w:r>
+      <w:bookmarkEnd w:id="105"/>
+    </w:p>
+    <w:p>
+      <w:pPr>
+        <w:numPr>
+          <w:ilvl w:val="0"/>
+          <w:numId w:val="1054"/>
+        </w:numPr>
         <w:pStyle w:val="Compact"/>
       </w:pPr>
       <w:r>
-        <w:t xml:space="preserve">The</w:t>
-      </w:r>
-      <w:r>
-        <w:t xml:space="preserve"> </w:t>
-      </w:r>
-      <w:r>
-        <w:rPr>
-          <w:rStyle w:val="VerbatimChar"/>
-        </w:rPr>
-        <w:t xml:space="preserve">[HIGH]</w:t>
-      </w:r>
-      <w:r>
-        <w:t xml:space="preserve"> </w:t>
-      </w:r>
-      <w:r>
-        <w:t xml:space="preserve">finding is SNMP community string</w:t>
-      </w:r>
-      <w:r>
-        <w:t xml:space="preserve"> </w:t>
-      </w:r>
-      <w:r>
-        <w:rPr>
-          <w:rStyle w:val="VerbatimChar"/>
-        </w:rPr>
-        <w:t xml:space="preserve">public</w:t>
-      </w:r>
-      <w:r>
-        <w:t xml:space="preserve"> </w:t>
-      </w:r>
-      <w:r>
-        <w:t xml:space="preserve">on</w:t>
-      </w:r>
-      <w:r>
-        <w:t xml:space="preserve"> </w:t>
-      </w:r>
-      <w:r>
-        <w:rPr>
-          <w:b/>
-        </w:rPr>
-        <w:t xml:space="preserve">10.50.1.30 (PRINT-P01)</w:t>
-      </w:r>
-      <w:r>
-        <w:t xml:space="preserve">, port 161/udp</w:t>
-      </w:r>
-    </w:p>
-    <w:p>
-      <w:pPr>
-        <w:numPr>
-          <w:ilvl w:val="0"/>
-          <w:numId w:val="1051"/>
-        </w:numPr>
-      </w:pPr>
-      <w:r>
-        <w:rPr>
-          <w:b/>
-        </w:rPr>
-        <w:t xml:space="preserve">Append the finding to</w:t>
-      </w:r>
-      <w:r>
-        <w:rPr>
-          <w:b/>
-        </w:rPr>
-        <w:t xml:space="preserve"> </w:t>
-      </w:r>
-      <w:r>
-        <w:rPr>
-          <w:rStyle w:val="VerbatimChar"/>
-          <w:b/>
-        </w:rPr>
-        <w:t xml:space="preserve">C:\CyberLab\PodXX\IA-Artifacts\Device_Config_Record.csv</w:t>
-      </w:r>
-      <w:r>
-        <w:rPr>
-          <w:b/>
-        </w:rPr>
-        <w:t xml:space="preserve">.</w:t>
-      </w:r>
-    </w:p>
-    <w:p>
-      <w:pPr>
-        <w:numPr>
-          <w:ilvl w:val="0"/>
-          <w:numId w:val="1000"/>
-        </w:numPr>
-        <w:pStyle w:val="BlockText"/>
-      </w:pPr>
-      <w:r>
-        <w:rPr>
-          <w:b/>
-        </w:rPr>
-        <w:t xml:space="preserve">Do not overwrite this file</w:t>
-      </w:r>
-      <w:r>
-        <w:t xml:space="preserve"> </w:t>
-      </w:r>
-      <w:r>
-        <w:t xml:space="preserve">— it still has to contain your M2-L2 rogue-device row (</w:t>
-      </w:r>
-      <w:r>
-        <w:rPr>
-          <w:rStyle w:val="VerbatimChar"/>
-        </w:rPr>
-        <w:t xml:space="preserve">AA-BB-CC-11-22-33</w:t>
-      </w:r>
-      <w:r>
-        <w:t xml:space="preserve"> </w:t>
-      </w:r>
-      <w:r>
-        <w:t xml:space="preserve">/</w:t>
-      </w:r>
-      <w:r>
-        <w:t xml:space="preserve"> </w:t>
-      </w:r>
-      <w:r>
-        <w:rPr>
-          <w:rStyle w:val="VerbatimChar"/>
-        </w:rPr>
-        <w:t xml:space="preserve">UNAUTHORIZED</w:t>
-      </w:r>
-      <w:r>
-        <w:t xml:space="preserve">) or M2-L2 will fail. Open it in Notepad and add a line at the end, for example:</w:t>
-      </w:r>
-    </w:p>
-    <w:p>
-      <w:pPr>
-        <w:numPr>
-          <w:ilvl w:val="0"/>
-          <w:numId w:val="1000"/>
-        </w:numPr>
-        <w:pStyle w:val="SourceCode"/>
-      </w:pPr>
-      <w:r>
-        <w:rPr>
-          <w:rStyle w:val="VerbatimChar"/>
-        </w:rPr>
-        <w:t xml:space="preserve">10.50.1.30,PRINT-P01,SNMP community string is 'public' (HIGH) - change to a complex value and restrict SNMP,OPEN,Network scan,From openvas_scan_report.txt</w:t>
-      </w:r>
-    </w:p>
-    <w:p>
-      <w:pPr>
-        <w:numPr>
-          <w:ilvl w:val="0"/>
-          <w:numId w:val="1000"/>
-        </w:numPr>
-      </w:pPr>
-      <w:r>
-        <w:t xml:space="preserve">Keeping both findings in one file is what the checker expects: the file must mention</w:t>
+        <w:t xml:space="preserve">☐</w:t>
+      </w:r>
+      <w:r>
+        <w:t xml:space="preserve"> </w:t>
+      </w:r>
+      <w:r>
+        <w:rPr>
+          <w:rStyle w:val="VerbatimChar"/>
+        </w:rPr>
+        <w:t xml:space="preserve">Device_Config_Record.csv</w:t>
+      </w:r>
+      <w:r>
+        <w:t xml:space="preserve"> </w:t>
+      </w:r>
+      <w:r>
+        <w:t xml:space="preserve">mentions</w:t>
       </w:r>
       <w:r>
         <w:t xml:space="preserve"> </w:t>
@@ -9898,186 +10238,12 @@
         </w:rPr>
         <w:t xml:space="preserve">SNMP</w:t>
       </w:r>
-      <w:r>
-        <w:t xml:space="preserve"> </w:t>
-      </w:r>
-      <w:r>
-        <w:t xml:space="preserve">(M4-L2)</w:t>
-      </w:r>
-      <w:r>
-        <w:t xml:space="preserve"> </w:t>
-      </w:r>
-      <w:r>
-        <w:rPr>
-          <w:b/>
-        </w:rPr>
-        <w:t xml:space="preserve">and</w:t>
-      </w:r>
-      <w:r>
-        <w:t xml:space="preserve"> </w:t>
-      </w:r>
-      <w:r>
-        <w:t xml:space="preserve">the rogue MAC marked</w:t>
-      </w:r>
-      <w:r>
-        <w:t xml:space="preserve"> </w:t>
-      </w:r>
-      <w:r>
-        <w:rPr>
-          <w:rStyle w:val="VerbatimChar"/>
-        </w:rPr>
-        <w:t xml:space="preserve">UNAUTHORIZED</w:t>
-      </w:r>
-      <w:r>
-        <w:t xml:space="preserve"> </w:t>
-      </w:r>
-      <w:r>
-        <w:t xml:space="preserve">must still be in</w:t>
-      </w:r>
-      <w:r>
-        <w:t xml:space="preserve"> </w:t>
-      </w:r>
-      <w:r>
-        <w:rPr>
-          <w:rStyle w:val="VerbatimChar"/>
-        </w:rPr>
-        <w:t xml:space="preserve">Authorized_Device_List.csv</w:t>
-      </w:r>
-      <w:r>
-        <w:t xml:space="preserve"> </w:t>
-      </w:r>
-      <w:r>
-        <w:t xml:space="preserve">(M2-L2).</w:t>
-      </w:r>
-    </w:p>
-    <w:p>
-      <w:pPr>
-        <w:numPr>
-          <w:ilvl w:val="0"/>
-          <w:numId w:val="1051"/>
-        </w:numPr>
-      </w:pPr>
-      <w:r>
-        <w:rPr>
-          <w:b/>
-        </w:rPr>
-        <w:t xml:space="preserve">Add an SNMP clause</w:t>
-      </w:r>
-      <w:r>
-        <w:t xml:space="preserve"> </w:t>
-      </w:r>
-      <w:r>
-        <w:t xml:space="preserve">to</w:t>
-      </w:r>
-      <w:r>
-        <w:t xml:space="preserve"> </w:t>
-      </w:r>
-      <w:r>
-        <w:rPr>
-          <w:rStyle w:val="VerbatimChar"/>
-        </w:rPr>
-        <w:t xml:space="preserve">Hardening_Standard.txt</w:t>
-      </w:r>
-      <w:r>
-        <w:t xml:space="preserve"> </w:t>
-      </w:r>
-      <w:r>
-        <w:t xml:space="preserve">(good practice, and it reinforces M4-L1):</w:t>
-      </w:r>
-    </w:p>
-    <w:p>
-      <w:pPr>
-        <w:numPr>
-          <w:ilvl w:val="0"/>
-          <w:numId w:val="1000"/>
-        </w:numPr>
-        <w:pStyle w:val="SourceCode"/>
-      </w:pPr>
-      <w:r>
-        <w:rPr>
-          <w:rStyle w:val="VerbatimChar"/>
-        </w:rPr>
-        <w:t xml:space="preserve">7. SNMP CONFIGURATION</w:t>
-      </w:r>
-      <w:r>
-        <w:br/>
-      </w:r>
-      <w:r>
-        <w:rPr>
-          <w:rStyle w:val="VerbatimChar"/>
-        </w:rPr>
-        <w:t xml:space="preserve">   - Default SNMP community strings (public, private) must be changed on all</w:t>
-      </w:r>
-      <w:r>
-        <w:br/>
-      </w:r>
-      <w:r>
-        <w:rPr>
-          <w:rStyle w:val="VerbatimChar"/>
-        </w:rPr>
-        <w:t xml:space="preserve">     network devices. Use SNMPv3 with authentication and encryption where</w:t>
-      </w:r>
-      <w:r>
-        <w:br/>
-      </w:r>
-      <w:r>
-        <w:rPr>
-          <w:rStyle w:val="VerbatimChar"/>
-        </w:rPr>
-        <w:t xml:space="preserve">     supported. SNMP v1/v2c with default strings is a critical finding.</w:t>
-      </w:r>
-    </w:p>
-    <w:p>
-      <w:pPr>
-        <w:pStyle w:val="Heading4"/>
-      </w:pPr>
-      <w:bookmarkStart w:id="105" w:name="completion-criteria-10"/>
-      <w:r>
-        <w:t xml:space="preserve">Completion Criteria</w:t>
-      </w:r>
-      <w:bookmarkEnd w:id="105"/>
-    </w:p>
-    <w:p>
-      <w:pPr>
-        <w:numPr>
-          <w:ilvl w:val="0"/>
-          <w:numId w:val="1053"/>
-        </w:numPr>
-        <w:pStyle w:val="Compact"/>
-      </w:pPr>
-      <w:r>
-        <w:t xml:space="preserve">☐</w:t>
-      </w:r>
-      <w:r>
-        <w:t xml:space="preserve"> </w:t>
-      </w:r>
-      <w:r>
-        <w:rPr>
-          <w:rStyle w:val="VerbatimChar"/>
-        </w:rPr>
-        <w:t xml:space="preserve">Device_Config_Record.csv</w:t>
-      </w:r>
-      <w:r>
-        <w:t xml:space="preserve"> </w:t>
-      </w:r>
-      <w:r>
-        <w:t xml:space="preserve">mentions</w:t>
-      </w:r>
-      <w:r>
-        <w:t xml:space="preserve"> </w:t>
-      </w:r>
-      <w:r>
-        <w:rPr>
-          <w:rStyle w:val="VerbatimChar"/>
-        </w:rPr>
-        <w:t xml:space="preserve">SNMP</w:t>
-      </w:r>
-    </w:p>
-    <w:p>
-      <w:pPr>
-        <w:numPr>
-          <w:ilvl w:val="0"/>
-          <w:numId w:val="1053"/>
+    </w:p>
+    <w:p>
+      <w:pPr>
+        <w:numPr>
+          <w:ilvl w:val="0"/>
+          <w:numId w:val="1054"/>
         </w:numPr>
         <w:pStyle w:val="Compact"/>
       </w:pPr>
@@ -10232,7 +10398,7 @@
       <w:pPr>
         <w:numPr>
           <w:ilvl w:val="0"/>
-          <w:numId w:val="1054"/>
+          <w:numId w:val="1055"/>
         </w:numPr>
         <w:pStyle w:val="Compact"/>
       </w:pPr>
@@ -10244,7 +10410,7 @@
       <w:pPr>
         <w:numPr>
           <w:ilvl w:val="0"/>
-          <w:numId w:val="1054"/>
+          <w:numId w:val="1055"/>
         </w:numPr>
         <w:pStyle w:val="Compact"/>
       </w:pPr>
@@ -10256,7 +10422,7 @@
       <w:pPr>
         <w:numPr>
           <w:ilvl w:val="0"/>
-          <w:numId w:val="1054"/>
+          <w:numId w:val="1055"/>
         </w:numPr>
         <w:pStyle w:val="Compact"/>
       </w:pPr>
@@ -10278,7 +10444,7 @@
       <w:pPr>
         <w:numPr>
           <w:ilvl w:val="0"/>
-          <w:numId w:val="1055"/>
+          <w:numId w:val="1056"/>
         </w:numPr>
       </w:pPr>
       <w:r>
@@ -10425,7 +10591,7 @@
       <w:pPr>
         <w:numPr>
           <w:ilvl w:val="0"/>
-          <w:numId w:val="1055"/>
+          <w:numId w:val="1056"/>
         </w:numPr>
       </w:pPr>
       <w:r>
@@ -10489,7 +10655,7 @@
       <w:pPr>
         <w:numPr>
           <w:ilvl w:val="0"/>
-          <w:numId w:val="1055"/>
+          <w:numId w:val="1056"/>
         </w:numPr>
       </w:pPr>
       <w:r>
@@ -10624,7 +10790,7 @@
       <w:pPr>
         <w:numPr>
           <w:ilvl w:val="0"/>
-          <w:numId w:val="1056"/>
+          <w:numId w:val="1057"/>
         </w:numPr>
         <w:pStyle w:val="Compact"/>
       </w:pPr>
@@ -10660,7 +10826,7 @@
       <w:pPr>
         <w:numPr>
           <w:ilvl w:val="0"/>
-          <w:numId w:val="1056"/>
+          <w:numId w:val="1057"/>
         </w:numPr>
         <w:pStyle w:val="Compact"/>
       </w:pPr>
@@ -10696,7 +10862,7 @@
       <w:pPr>
         <w:numPr>
           <w:ilvl w:val="0"/>
-          <w:numId w:val="1056"/>
+          <w:numId w:val="1057"/>
         </w:numPr>
         <w:pStyle w:val="Compact"/>
       </w:pPr>
@@ -10738,7 +10904,7 @@
       <w:pPr>
         <w:numPr>
           <w:ilvl w:val="0"/>
-          <w:numId w:val="1056"/>
+          <w:numId w:val="1057"/>
         </w:numPr>
         <w:pStyle w:val="Compact"/>
       </w:pPr>
@@ -11478,7 +11644,7 @@
       <w:pPr>
         <w:numPr>
           <w:ilvl w:val="0"/>
-          <w:numId w:val="1057"/>
+          <w:numId w:val="1058"/>
         </w:numPr>
         <w:pStyle w:val="Compact"/>
       </w:pPr>
@@ -11508,7 +11674,7 @@
       <w:pPr>
         <w:numPr>
           <w:ilvl w:val="0"/>
-          <w:numId w:val="1057"/>
+          <w:numId w:val="1058"/>
         </w:numPr>
         <w:pStyle w:val="Compact"/>
       </w:pPr>
@@ -11563,7 +11729,7 @@
       <w:pPr>
         <w:numPr>
           <w:ilvl w:val="0"/>
-          <w:numId w:val="1057"/>
+          <w:numId w:val="1058"/>
         </w:numPr>
         <w:pStyle w:val="Compact"/>
       </w:pPr>
@@ -11617,7 +11783,7 @@
       <w:pPr>
         <w:numPr>
           <w:ilvl w:val="0"/>
-          <w:numId w:val="1057"/>
+          <w:numId w:val="1058"/>
         </w:numPr>
         <w:pStyle w:val="Compact"/>
       </w:pPr>
@@ -11638,7 +11804,7 @@
       <w:pPr>
         <w:numPr>
           <w:ilvl w:val="0"/>
-          <w:numId w:val="1057"/>
+          <w:numId w:val="1058"/>
         </w:numPr>
         <w:pStyle w:val="Compact"/>
       </w:pPr>
@@ -11669,7 +11835,7 @@
       <w:pPr>
         <w:numPr>
           <w:ilvl w:val="0"/>
-          <w:numId w:val="1058"/>
+          <w:numId w:val="1059"/>
         </w:numPr>
         <w:pStyle w:val="Compact"/>
       </w:pPr>
@@ -11714,7 +11880,7 @@
       <w:pPr>
         <w:numPr>
           <w:ilvl w:val="0"/>
-          <w:numId w:val="1058"/>
+          <w:numId w:val="1059"/>
         </w:numPr>
         <w:pStyle w:val="Compact"/>
       </w:pPr>
@@ -11735,7 +11901,7 @@
       <w:pPr>
         <w:numPr>
           <w:ilvl w:val="0"/>
-          <w:numId w:val="1058"/>
+          <w:numId w:val="1059"/>
         </w:numPr>
         <w:pStyle w:val="Compact"/>
       </w:pPr>
@@ -11771,7 +11937,7 @@
       <w:pPr>
         <w:numPr>
           <w:ilvl w:val="0"/>
-          <w:numId w:val="1058"/>
+          <w:numId w:val="1059"/>
         </w:numPr>
         <w:pStyle w:val="Compact"/>
       </w:pPr>
@@ -11792,7 +11958,7 @@
       <w:pPr>
         <w:numPr>
           <w:ilvl w:val="0"/>
-          <w:numId w:val="1058"/>
+          <w:numId w:val="1059"/>
         </w:numPr>
         <w:pStyle w:val="Compact"/>
       </w:pPr>
@@ -14014,34 +14180,7 @@
     <w:abstractNumId w:val="991"/>
   </w:num>
   <w:num w:numId="1044">
-    <w:abstractNumId w:val="99211"/>
-    <w:lvlOverride w:ilvl="0">
-      <w:startOverride w:val="1"/>
-    </w:lvlOverride>
-    <w:lvlOverride w:ilvl="1">
-      <w:startOverride w:val="1"/>
-    </w:lvlOverride>
-    <w:lvlOverride w:ilvl="2">
-      <w:startOverride w:val="1"/>
-    </w:lvlOverride>
-    <w:lvlOverride w:ilvl="3">
-      <w:startOverride w:val="1"/>
-    </w:lvlOverride>
-    <w:lvlOverride w:ilvl="4">
-      <w:startOverride w:val="1"/>
-    </w:lvlOverride>
-    <w:lvlOverride w:ilvl="5">
-      <w:startOverride w:val="1"/>
-    </w:lvlOverride>
-    <w:lvlOverride w:ilvl="6">
-      <w:startOverride w:val="1"/>
-    </w:lvlOverride>
-    <w:lvlOverride w:ilvl="7">
-      <w:startOverride w:val="1"/>
-    </w:lvlOverride>
-    <w:lvlOverride w:ilvl="8">
-      <w:startOverride w:val="1"/>
-    </w:lvlOverride>
+    <w:abstractNumId w:val="991"/>
   </w:num>
   <w:num w:numId="1045">
     <w:abstractNumId w:val="99211"/>
@@ -14074,37 +14213,37 @@
     </w:lvlOverride>
   </w:num>
   <w:num w:numId="1046">
-    <w:abstractNumId w:val="991"/>
+    <w:abstractNumId w:val="99211"/>
+    <w:lvlOverride w:ilvl="0">
+      <w:startOverride w:val="1"/>
+    </w:lvlOverride>
+    <w:lvlOverride w:ilvl="1">
+      <w:startOverride w:val="1"/>
+    </w:lvlOverride>
+    <w:lvlOverride w:ilvl="2">
+      <w:startOverride w:val="1"/>
+    </w:lvlOverride>
+    <w:lvlOverride w:ilvl="3">
+      <w:startOverride w:val="1"/>
+    </w:lvlOverride>
+    <w:lvlOverride w:ilvl="4">
+      <w:startOverride w:val="1"/>
+    </w:lvlOverride>
+    <w:lvlOverride w:ilvl="5">
+      <w:startOverride w:val="1"/>
+    </w:lvlOverride>
+    <w:lvlOverride w:ilvl="6">
+      <w:startOverride w:val="1"/>
+    </w:lvlOverride>
+    <w:lvlOverride w:ilvl="7">
+      <w:startOverride w:val="1"/>
+    </w:lvlOverride>
+    <w:lvlOverride w:ilvl="8">
+      <w:startOverride w:val="1"/>
+    </w:lvlOverride>
   </w:num>
   <w:num w:numId="1047">
-    <w:abstractNumId w:val="99211"/>
-    <w:lvlOverride w:ilvl="0">
-      <w:startOverride w:val="1"/>
-    </w:lvlOverride>
-    <w:lvlOverride w:ilvl="1">
-      <w:startOverride w:val="1"/>
-    </w:lvlOverride>
-    <w:lvlOverride w:ilvl="2">
-      <w:startOverride w:val="1"/>
-    </w:lvlOverride>
-    <w:lvlOverride w:ilvl="3">
-      <w:startOverride w:val="1"/>
-    </w:lvlOverride>
-    <w:lvlOverride w:ilvl="4">
-      <w:startOverride w:val="1"/>
-    </w:lvlOverride>
-    <w:lvlOverride w:ilvl="5">
-      <w:startOverride w:val="1"/>
-    </w:lvlOverride>
-    <w:lvlOverride w:ilvl="6">
-      <w:startOverride w:val="1"/>
-    </w:lvlOverride>
-    <w:lvlOverride w:ilvl="7">
-      <w:startOverride w:val="1"/>
-    </w:lvlOverride>
-    <w:lvlOverride w:ilvl="8">
-      <w:startOverride w:val="1"/>
-    </w:lvlOverride>
+    <w:abstractNumId w:val="991"/>
   </w:num>
   <w:num w:numId="1048">
     <w:abstractNumId w:val="99211"/>
@@ -14137,37 +14276,37 @@
     </w:lvlOverride>
   </w:num>
   <w:num w:numId="1049">
-    <w:abstractNumId w:val="991"/>
+    <w:abstractNumId w:val="99211"/>
+    <w:lvlOverride w:ilvl="0">
+      <w:startOverride w:val="1"/>
+    </w:lvlOverride>
+    <w:lvlOverride w:ilvl="1">
+      <w:startOverride w:val="1"/>
+    </w:lvlOverride>
+    <w:lvlOverride w:ilvl="2">
+      <w:startOverride w:val="1"/>
+    </w:lvlOverride>
+    <w:lvlOverride w:ilvl="3">
+      <w:startOverride w:val="1"/>
+    </w:lvlOverride>
+    <w:lvlOverride w:ilvl="4">
+      <w:startOverride w:val="1"/>
+    </w:lvlOverride>
+    <w:lvlOverride w:ilvl="5">
+      <w:startOverride w:val="1"/>
+    </w:lvlOverride>
+    <w:lvlOverride w:ilvl="6">
+      <w:startOverride w:val="1"/>
+    </w:lvlOverride>
+    <w:lvlOverride w:ilvl="7">
+      <w:startOverride w:val="1"/>
+    </w:lvlOverride>
+    <w:lvlOverride w:ilvl="8">
+      <w:startOverride w:val="1"/>
+    </w:lvlOverride>
   </w:num>
   <w:num w:numId="1050">
-    <w:abstractNumId w:val="99211"/>
-    <w:lvlOverride w:ilvl="0">
-      <w:startOverride w:val="1"/>
-    </w:lvlOverride>
-    <w:lvlOverride w:ilvl="1">
-      <w:startOverride w:val="1"/>
-    </w:lvlOverride>
-    <w:lvlOverride w:ilvl="2">
-      <w:startOverride w:val="1"/>
-    </w:lvlOverride>
-    <w:lvlOverride w:ilvl="3">
-      <w:startOverride w:val="1"/>
-    </w:lvlOverride>
-    <w:lvlOverride w:ilvl="4">
-      <w:startOverride w:val="1"/>
-    </w:lvlOverride>
-    <w:lvlOverride w:ilvl="5">
-      <w:startOverride w:val="1"/>
-    </w:lvlOverride>
-    <w:lvlOverride w:ilvl="6">
-      <w:startOverride w:val="1"/>
-    </w:lvlOverride>
-    <w:lvlOverride w:ilvl="7">
-      <w:startOverride w:val="1"/>
-    </w:lvlOverride>
-    <w:lvlOverride w:ilvl="8">
-      <w:startOverride w:val="1"/>
-    </w:lvlOverride>
+    <w:abstractNumId w:val="991"/>
   </w:num>
   <w:num w:numId="1051">
     <w:abstractNumId w:val="99211"/>
@@ -14200,40 +14339,40 @@
     </w:lvlOverride>
   </w:num>
   <w:num w:numId="1052">
-    <w:abstractNumId w:val="991"/>
+    <w:abstractNumId w:val="99211"/>
+    <w:lvlOverride w:ilvl="0">
+      <w:startOverride w:val="1"/>
+    </w:lvlOverride>
+    <w:lvlOverride w:ilvl="1">
+      <w:startOverride w:val="1"/>
+    </w:lvlOverride>
+    <w:lvlOverride w:ilvl="2">
+      <w:startOverride w:val="1"/>
+    </w:lvlOverride>
+    <w:lvlOverride w:ilvl="3">
+      <w:startOverride w:val="1"/>
+    </w:lvlOverride>
+    <w:lvlOverride w:ilvl="4">
+      <w:startOverride w:val="1"/>
+    </w:lvlOverride>
+    <w:lvlOverride w:ilvl="5">
+      <w:startOverride w:val="1"/>
+    </w:lvlOverride>
+    <w:lvlOverride w:ilvl="6">
+      <w:startOverride w:val="1"/>
+    </w:lvlOverride>
+    <w:lvlOverride w:ilvl="7">
+      <w:startOverride w:val="1"/>
+    </w:lvlOverride>
+    <w:lvlOverride w:ilvl="8">
+      <w:startOverride w:val="1"/>
+    </w:lvlOverride>
   </w:num>
   <w:num w:numId="1053">
     <w:abstractNumId w:val="991"/>
   </w:num>
   <w:num w:numId="1054">
-    <w:abstractNumId w:val="99211"/>
-    <w:lvlOverride w:ilvl="0">
-      <w:startOverride w:val="1"/>
-    </w:lvlOverride>
-    <w:lvlOverride w:ilvl="1">
-      <w:startOverride w:val="1"/>
-    </w:lvlOverride>
-    <w:lvlOverride w:ilvl="2">
-      <w:startOverride w:val="1"/>
-    </w:lvlOverride>
-    <w:lvlOverride w:ilvl="3">
-      <w:startOverride w:val="1"/>
-    </w:lvlOverride>
-    <w:lvlOverride w:ilvl="4">
-      <w:startOverride w:val="1"/>
-    </w:lvlOverride>
-    <w:lvlOverride w:ilvl="5">
-      <w:startOverride w:val="1"/>
-    </w:lvlOverride>
-    <w:lvlOverride w:ilvl="6">
-      <w:startOverride w:val="1"/>
-    </w:lvlOverride>
-    <w:lvlOverride w:ilvl="7">
-      <w:startOverride w:val="1"/>
-    </w:lvlOverride>
-    <w:lvlOverride w:ilvl="8">
-      <w:startOverride w:val="1"/>
-    </w:lvlOverride>
+    <w:abstractNumId w:val="991"/>
   </w:num>
   <w:num w:numId="1055">
     <w:abstractNumId w:val="99211"/>
@@ -14266,12 +14405,42 @@
     </w:lvlOverride>
   </w:num>
   <w:num w:numId="1056">
-    <w:abstractNumId w:val="991"/>
+    <w:abstractNumId w:val="99211"/>
+    <w:lvlOverride w:ilvl="0">
+      <w:startOverride w:val="1"/>
+    </w:lvlOverride>
+    <w:lvlOverride w:ilvl="1">
+      <w:startOverride w:val="1"/>
+    </w:lvlOverride>
+    <w:lvlOverride w:ilvl="2">
+      <w:startOverride w:val="1"/>
+    </w:lvlOverride>
+    <w:lvlOverride w:ilvl="3">
+      <w:startOverride w:val="1"/>
+    </w:lvlOverride>
+    <w:lvlOverride w:ilvl="4">
+      <w:startOverride w:val="1"/>
+    </w:lvlOverride>
+    <w:lvlOverride w:ilvl="5">
+      <w:startOverride w:val="1"/>
+    </w:lvlOverride>
+    <w:lvlOverride w:ilvl="6">
+      <w:startOverride w:val="1"/>
+    </w:lvlOverride>
+    <w:lvlOverride w:ilvl="7">
+      <w:startOverride w:val="1"/>
+    </w:lvlOverride>
+    <w:lvlOverride w:ilvl="8">
+      <w:startOverride w:val="1"/>
+    </w:lvlOverride>
   </w:num>
   <w:num w:numId="1057">
     <w:abstractNumId w:val="991"/>
   </w:num>
   <w:num w:numId="1058">
+    <w:abstractNumId w:val="991"/>
+  </w:num>
+  <w:num w:numId="1059">
     <w:abstractNumId w:val="991"/>
   </w:num>
 </w:numbering>

</xml_diff>